<commit_message>
Attribute the project to ACPIE_Lab; remove the LICENSE file
Author line in both READMEs and the 操作手冊 (cover of the .docx too); the README
License section becomes 'Author and third-party notices'; THIRD_PARTY_LICENSES.md no
longer points at a LICENSE file.
</commit_message>
<xml_diff>
--- a/docs/操作手冊.docx
+++ b/docs/操作手冊.docx
@@ -38,7 +38,7 @@
     </w:p>
     <w:p>
       <w:pPr>
-        <w:spacing w:after="900"/>
+        <w:spacing w:after="200"/>
         <w:jc w:val="center"/>
       </w:pPr>
       <w:r>
@@ -53,26 +53,25 @@
     </w:p>
     <w:p>
       <w:pPr>
-        <w:spacing w:after="120" w:line="300"/>
+        <w:spacing w:after="700"/>
+        <w:jc w:val="center"/>
       </w:pPr>
       <w:r>
         <w:rPr>
           <w:rFonts w:ascii="Calibri" w:cs="Calibri" w:eastAsia="Microsoft JhengHei" w:hAnsi="Calibri"/>
           <w:b/>
           <w:bCs/>
-          <w:sz w:val="21"/>
-          <w:szCs w:val="21"/>
-        </w:rPr>
-        <w:t xml:space="preserve">適用對象：</w:t>
-      </w:r>
-      <w:r>
-        <w:rPr>
-          <w:rFonts w:ascii="Calibri" w:cs="Calibri" w:eastAsia="Microsoft JhengHei" w:hAnsi="Calibri"/>
-          <w:sz w:val="21"/>
-          <w:szCs w:val="21"/>
-        </w:rPr>
-        <w:t xml:space="preserve"> 接手維運本系統、但不一定熟悉程式的人員。本手冊以「照著做」為原則， 每個步驟都附指令；想了解「為什麼」時，再看 </w:t>
-      </w:r>
+          <w:color w:val="2F5496"/>
+          <w:sz w:val="26"/>
+          <w:szCs w:val="26"/>
+        </w:rPr>
+        <w:t xml:space="preserve">ACPIE_Lab</w:t>
+      </w:r>
+    </w:p>
+    <w:p>
+      <w:pPr>
+        <w:spacing w:after="120" w:line="300"/>
+      </w:pPr>
       <w:r>
         <w:rPr>
           <w:rFonts w:ascii="Calibri" w:cs="Calibri" w:eastAsia="Microsoft JhengHei" w:hAnsi="Calibri"/>
@@ -81,15 +80,15 @@
           <w:sz w:val="21"/>
           <w:szCs w:val="21"/>
         </w:rPr>
-        <w:t xml:space="preserve">README.zh-Hant.md</w:t>
-      </w:r>
-      <w:r>
-        <w:rPr>
-          <w:rFonts w:ascii="Calibri" w:cs="Calibri" w:eastAsia="Microsoft JhengHei" w:hAnsi="Calibri"/>
-          <w:sz w:val="21"/>
-          <w:szCs w:val="21"/>
-        </w:rPr>
-        <w:t xml:space="preserve"> 與 </w:t>
+        <w:t xml:space="preserve">適用對象：</w:t>
+      </w:r>
+      <w:r>
+        <w:rPr>
+          <w:rFonts w:ascii="Calibri" w:cs="Calibri" w:eastAsia="Microsoft JhengHei" w:hAnsi="Calibri"/>
+          <w:sz w:val="21"/>
+          <w:szCs w:val="21"/>
+        </w:rPr>
+        <w:t xml:space="preserve"> 接手維運本系統、但不一定熟悉程式的人員。本手冊以「照著做」為原則， 每個步驟都附指令；想了解「為什麼」時，再看 </w:t>
       </w:r>
       <w:r>
         <w:rPr>
@@ -99,21 +98,16 @@
           <w:sz w:val="21"/>
           <w:szCs w:val="21"/>
         </w:rPr>
-        <w:t xml:space="preserve">MAINTENANCE.zh-Hant.md</w:t>
-      </w:r>
-      <w:r>
-        <w:rPr>
-          <w:rFonts w:ascii="Calibri" w:cs="Calibri" w:eastAsia="Microsoft JhengHei" w:hAnsi="Calibri"/>
-          <w:sz w:val="21"/>
-          <w:szCs w:val="21"/>
-        </w:rPr>
-        <w:t xml:space="preserve">。</w:t>
-      </w:r>
-    </w:p>
-    <w:p>
-      <w:pPr>
-        <w:spacing w:after="120" w:line="300"/>
-      </w:pPr>
+        <w:t xml:space="preserve">README.zh-Hant.md</w:t>
+      </w:r>
+      <w:r>
+        <w:rPr>
+          <w:rFonts w:ascii="Calibri" w:cs="Calibri" w:eastAsia="Microsoft JhengHei" w:hAnsi="Calibri"/>
+          <w:sz w:val="21"/>
+          <w:szCs w:val="21"/>
+        </w:rPr>
+        <w:t xml:space="preserve"> 與 </w:t>
+      </w:r>
       <w:r>
         <w:rPr>
           <w:rFonts w:ascii="Calibri" w:cs="Calibri" w:eastAsia="Microsoft JhengHei" w:hAnsi="Calibri"/>
@@ -122,6 +116,29 @@
           <w:sz w:val="21"/>
           <w:szCs w:val="21"/>
         </w:rPr>
+        <w:t xml:space="preserve">MAINTENANCE.zh-Hant.md</w:t>
+      </w:r>
+      <w:r>
+        <w:rPr>
+          <w:rFonts w:ascii="Calibri" w:cs="Calibri" w:eastAsia="Microsoft JhengHei" w:hAnsi="Calibri"/>
+          <w:sz w:val="21"/>
+          <w:szCs w:val="21"/>
+        </w:rPr>
+        <w:t xml:space="preserve">。</w:t>
+      </w:r>
+    </w:p>
+    <w:p>
+      <w:pPr>
+        <w:spacing w:after="120" w:line="300"/>
+      </w:pPr>
+      <w:r>
+        <w:rPr>
+          <w:rFonts w:ascii="Calibri" w:cs="Calibri" w:eastAsia="Microsoft JhengHei" w:hAnsi="Calibri"/>
+          <w:b/>
+          <w:bCs/>
+          <w:sz w:val="21"/>
+          <w:szCs w:val="21"/>
+        </w:rPr>
         <w:t xml:space="preserve">程式儲存庫：</w:t>
       </w:r>
       <w:r>
@@ -132,7 +149,7 @@
         </w:rPr>
         <w:t xml:space="preserve"> </w:t>
       </w:r>
-      <w:hyperlink w:history="1" r:id="rIdq_3uruhd3qlkeguqgktfs">
+      <w:hyperlink w:history="1" r:id="rIdiw4h5uncqxygpda7pxaeb">
         <w:r>
           <w:rPr>
             <w:rStyle w:val="Hyperlink"/>
@@ -143,6 +160,29 @@
           <w:t xml:space="preserve">https://github.com/Kitty2xl/HIWIN_Support_Agent</w:t>
         </w:r>
       </w:hyperlink>
+    </w:p>
+    <w:p>
+      <w:pPr>
+        <w:spacing w:after="120" w:line="300"/>
+      </w:pPr>
+      <w:r>
+        <w:rPr>
+          <w:rFonts w:ascii="Calibri" w:cs="Calibri" w:eastAsia="Microsoft JhengHei" w:hAnsi="Calibri"/>
+          <w:b/>
+          <w:bCs/>
+          <w:sz w:val="21"/>
+          <w:szCs w:val="21"/>
+        </w:rPr>
+        <w:t xml:space="preserve">作者：</w:t>
+      </w:r>
+      <w:r>
+        <w:rPr>
+          <w:rFonts w:ascii="Calibri" w:cs="Calibri" w:eastAsia="Microsoft JhengHei" w:hAnsi="Calibri"/>
+          <w:sz w:val="21"/>
+          <w:szCs w:val="21"/>
+        </w:rPr>
+        <w:t xml:space="preserve"> ACPIE_Lab</w:t>
+      </w:r>
     </w:p>
     <w:p>
       <w:pPr>
@@ -2146,7 +2186,7 @@
             <w:pPr>
               <w:spacing w:after="0" w:line="276"/>
             </w:pPr>
-            <w:hyperlink w:history="1" r:id="rIddwy-okb9ict6ejphvnsi6">
+            <w:hyperlink w:history="1" r:id="rIdt0gh-og1vjhkdw4ib7zr6">
               <w:r>
                 <w:rPr>
                   <w:rStyle w:val="Hyperlink"/>
@@ -2165,7 +2205,7 @@
               </w:rPr>
               <w:t xml:space="preserve"> （展示頁）、</w:t>
             </w:r>
-            <w:hyperlink w:history="1" r:id="rIdme-wezruxpajwnddzuaky">
+            <w:hyperlink w:history="1" r:id="rIdum8bijamzo-qbslq5xdjy">
               <w:r>
                 <w:rPr>
                   <w:rStyle w:val="Hyperlink"/>
@@ -2230,7 +2270,7 @@
             <w:pPr>
               <w:spacing w:after="0" w:line="276"/>
             </w:pPr>
-            <w:hyperlink w:history="1" r:id="rId2pwmkxqafd_sf0nftftqu">
+            <w:hyperlink w:history="1" r:id="rIdob6nkhziuq1juuzeur_rd">
               <w:r>
                 <w:rPr>
                   <w:rStyle w:val="Hyperlink"/>
@@ -2655,7 +2695,7 @@
         </w:rPr>
         <w:t xml:space="preserve">☐ 儲存庫存取權：</w:t>
       </w:r>
-      <w:hyperlink w:history="1" r:id="rIdvnz2flsj2vkuubo7jbkma">
+      <w:hyperlink w:history="1" r:id="rId6duvfh7udr9mey-ptmoi7">
         <w:r>
           <w:rPr>
             <w:rStyle w:val="Hyperlink"/>
@@ -3762,7 +3802,7 @@
         </w:rPr>
         <w:t xml:space="preserve">或直接用瀏覽器開 </w:t>
       </w:r>
-      <w:hyperlink w:history="1" r:id="rId8le0j86vl9mp494b_owio">
+      <w:hyperlink w:history="1" r:id="rIdmybti6e8yr0zho_umrgxr">
         <w:r>
           <w:rPr>
             <w:rStyle w:val="Hyperlink"/>
@@ -3996,7 +4036,7 @@
         </w:rPr>
         <w:t xml:space="preserve">瀏覽器開 </w:t>
       </w:r>
-      <w:hyperlink w:history="1" r:id="rId90xzjuoinuibsflg_-qgm">
+      <w:hyperlink w:history="1" r:id="rId2zkrjkexato3n2k4w7q2i">
         <w:r>
           <w:rPr>
             <w:rStyle w:val="Hyperlink"/>
@@ -5180,7 +5220,7 @@
               </w:rPr>
               <w:t xml:space="preserve">後端執行中可開 </w:t>
             </w:r>
-            <w:hyperlink w:history="1" r:id="rIdgaa0jt33grq55qy44xboj">
+            <w:hyperlink w:history="1" r:id="rIdmskpdzblfxbeocfqqrjc8">
               <w:r>
                 <w:rPr>
                   <w:rStyle w:val="Hyperlink"/>
@@ -10331,7 +10371,7 @@
         </w:rPr>
         <w:t xml:space="preserve"> </w:t>
       </w:r>
-      <w:hyperlink w:history="1" r:id="rId1ixkptfbvq2wx2lvndx85">
+      <w:hyperlink w:history="1" r:id="rId2c9hzoaqclsivkucu20a3">
         <w:r>
           <w:rPr>
             <w:rStyle w:val="Hyperlink"/>

</xml_diff>